<commit_message>
ML design doc updated
</commit_message>
<xml_diff>
--- a/ML Design.docx
+++ b/ML Design.docx
@@ -2,7 +2,392 @@
 <file path=word/document.xml><?xml version="1.0" encoding="utf-8"?>
 <w:document xmlns:wpc="http://schemas.microsoft.com/office/word/2010/wordprocessingCanvas" xmlns:cx="http://schemas.microsoft.com/office/drawing/2014/chartex" xmlns:cx1="http://schemas.microsoft.com/office/drawing/2015/9/8/chartex" xmlns:cx2="http://schemas.microsoft.com/office/drawing/2015/10/21/chartex" xmlns:cx3="http://schemas.microsoft.com/office/drawing/2016/5/9/chartex" xmlns:cx4="http://schemas.microsoft.com/office/drawing/2016/5/10/chartex" xmlns:cx5="http://schemas.microsoft.com/office/drawing/2016/5/11/chartex" xmlns:cx6="http://schemas.microsoft.com/office/drawing/2016/5/12/chartex" xmlns:cx7="http://schemas.microsoft.com/office/drawing/2016/5/13/chartex" xmlns:cx8="http://schemas.microsoft.com/office/drawing/2016/5/14/chartex" xmlns:mc="http://schemas.openxmlformats.org/markup-compatibility/2006" xmlns:aink="http://schemas.microsoft.com/office/drawing/2016/ink" xmlns:am3d="http://schemas.microsoft.com/office/drawing/2017/model3d" xmlns:o="urn:schemas-microsoft-com:office:office" xmlns:oel="http://schemas.microsoft.com/office/2019/extlst" xmlns:r="http://schemas.openxmlformats.org/officeDocument/2006/relationships" xmlns:m="http://schemas.openxmlformats.org/officeDocument/2006/math" xmlns:v="urn:schemas-microsoft-com:vml" xmlns:wp14="http://schemas.microsoft.com/office/word/2010/wordprocessingDrawing" xmlns:wp="http://schemas.openxmlformats.org/drawingml/2006/wordprocessingDrawing" xmlns:w10="urn:schemas-microsoft-com:office:word" xmlns:w="http://schemas.openxmlformats.org/wordprocessingml/2006/main" xmlns:w14="http://schemas.microsoft.com/office/word/2010/wordml" xmlns:w15="http://schemas.microsoft.com/office/word/2012/wordml" xmlns:w16cex="http://schemas.microsoft.com/office/word/2018/wordml/cex" xmlns:w16cid="http://schemas.microsoft.com/office/word/2016/wordml/cid" xmlns:w16="http://schemas.microsoft.com/office/word/2018/wordml" xmlns:w16du="http://schemas.microsoft.com/office/word/2023/wordml/word16du" xmlns:w16sdtdh="http://schemas.microsoft.com/office/word/2020/wordml/sdtdatahash" xmlns:w16sdtfl="http://schemas.microsoft.com/office/word/2024/wordml/sdtformatlock" xmlns:w16se="http://schemas.microsoft.com/office/word/2015/wordml/symex" xmlns:wpg="http://schemas.microsoft.com/office/word/2010/wordprocessingGroup" xmlns:wpi="http://schemas.microsoft.com/office/word/2010/wordprocessingInk" xmlns:wne="http://schemas.microsoft.com/office/word/2006/wordml" xmlns:wps="http://schemas.microsoft.com/office/word/2010/wordprocessingShape" mc:Ignorable="w14 w15 w16se w16cid w16 w16cex w16sdtdh w16sdtfl w16du wp14">
   <w:body>
-    <w:p/>
+    <w:p>
+      <w:pPr>
+        <w:pStyle w:val="Heading1"/>
+      </w:pPr>
+      <w:r>
+        <w:t>Harmful Content Detection</w:t>
+      </w:r>
+    </w:p>
+    <w:p>
+      <w:r>
+        <w:t>Problem Framing</w:t>
+      </w:r>
+    </w:p>
+    <w:p>
+      <w:pPr>
+        <w:pStyle w:val="ListParagraph"/>
+        <w:numPr>
+          <w:ilvl w:val="0"/>
+          <w:numId w:val="1"/>
+        </w:numPr>
+      </w:pPr>
+      <w:r>
+        <w:t>Questions to ask or assumption to make</w:t>
+      </w:r>
+    </w:p>
+    <w:p>
+      <w:pPr>
+        <w:pStyle w:val="ListParagraph"/>
+        <w:numPr>
+          <w:ilvl w:val="1"/>
+          <w:numId w:val="1"/>
+        </w:numPr>
+      </w:pPr>
+      <w:r>
+        <w:t>Are posts text only or can they include images, videos, or other media?</w:t>
+      </w:r>
+    </w:p>
+    <w:p>
+      <w:pPr>
+        <w:pStyle w:val="ListParagraph"/>
+        <w:numPr>
+          <w:ilvl w:val="2"/>
+          <w:numId w:val="1"/>
+        </w:numPr>
+      </w:pPr>
+      <w:r>
+        <w:t>Text and images only, (do videos if time allows)</w:t>
+      </w:r>
+    </w:p>
+    <w:p>
+      <w:pPr>
+        <w:pStyle w:val="ListParagraph"/>
+        <w:numPr>
+          <w:ilvl w:val="1"/>
+          <w:numId w:val="1"/>
+        </w:numPr>
+      </w:pPr>
+      <w:r>
+        <w:t>What kind of content deo we want to detect?</w:t>
+      </w:r>
+    </w:p>
+    <w:p>
+      <w:pPr>
+        <w:pStyle w:val="ListParagraph"/>
+        <w:numPr>
+          <w:ilvl w:val="2"/>
+          <w:numId w:val="1"/>
+        </w:numPr>
+      </w:pPr>
+      <w:r>
+        <w:t>All, nudity, violence, all the way to terrorism and human trafficking</w:t>
+      </w:r>
+    </w:p>
+    <w:p>
+      <w:pPr>
+        <w:pStyle w:val="ListParagraph"/>
+        <w:numPr>
+          <w:ilvl w:val="1"/>
+          <w:numId w:val="1"/>
+        </w:numPr>
+      </w:pPr>
+      <w:r>
+        <w:t xml:space="preserve">What happens if we find harmful content? </w:t>
+      </w:r>
+    </w:p>
+    <w:p>
+      <w:pPr>
+        <w:pStyle w:val="ListParagraph"/>
+        <w:numPr>
+          <w:ilvl w:val="2"/>
+          <w:numId w:val="1"/>
+        </w:numPr>
+      </w:pPr>
+      <w:r>
+        <w:t xml:space="preserve">Assume we can automatically remove harmful content and demote likely harmful content. </w:t>
+      </w:r>
+    </w:p>
+    <w:p>
+      <w:pPr>
+        <w:pStyle w:val="ListParagraph"/>
+        <w:numPr>
+          <w:ilvl w:val="2"/>
+          <w:numId w:val="1"/>
+        </w:numPr>
+      </w:pPr>
+      <w:r>
+        <w:t>We also have a small team of moderators who can review content, but with limited capacity</w:t>
+      </w:r>
+    </w:p>
+    <w:p>
+      <w:pPr>
+        <w:pStyle w:val="ListParagraph"/>
+        <w:numPr>
+          <w:ilvl w:val="1"/>
+          <w:numId w:val="1"/>
+        </w:numPr>
+      </w:pPr>
+      <w:r>
+        <w:t xml:space="preserve">What are the consequences of false positives and false negatives? </w:t>
+      </w:r>
+    </w:p>
+    <w:p>
+      <w:pPr>
+        <w:pStyle w:val="ListParagraph"/>
+        <w:numPr>
+          <w:ilvl w:val="2"/>
+          <w:numId w:val="1"/>
+        </w:numPr>
+      </w:pPr>
+      <w:r>
+        <w:t>Users who have their content wrongly removed (false positive) will be unhappy and may leave the platform</w:t>
+      </w:r>
+    </w:p>
+    <w:p>
+      <w:pPr>
+        <w:pStyle w:val="ListParagraph"/>
+        <w:numPr>
+          <w:ilvl w:val="2"/>
+          <w:numId w:val="1"/>
+        </w:numPr>
+      </w:pPr>
+      <w:r>
+        <w:t>Users who see excessive harmful content (too much false negatives) may get offended and leave the platform as well</w:t>
+      </w:r>
+    </w:p>
+    <w:p>
+      <w:pPr>
+        <w:pStyle w:val="ListParagraph"/>
+        <w:numPr>
+          <w:ilvl w:val="2"/>
+          <w:numId w:val="1"/>
+        </w:numPr>
+      </w:pPr>
+      <w:r>
+        <w:t>Set a confidence level of 95%, that we will only remove content if we are 95% confident that it is harmful</w:t>
+      </w:r>
+    </w:p>
+    <w:p>
+      <w:pPr>
+        <w:pStyle w:val="ListParagraph"/>
+        <w:numPr>
+          <w:ilvl w:val="1"/>
+          <w:numId w:val="1"/>
+        </w:numPr>
+      </w:pPr>
+      <w:r>
+        <w:t xml:space="preserve">How quickly do we need to detect harmful content? </w:t>
+      </w:r>
+    </w:p>
+    <w:p>
+      <w:pPr>
+        <w:pStyle w:val="ListParagraph"/>
+        <w:numPr>
+          <w:ilvl w:val="2"/>
+          <w:numId w:val="1"/>
+        </w:numPr>
+      </w:pPr>
+      <w:r>
+        <w:t xml:space="preserve">As soon as it </w:t>
+      </w:r>
+      <w:proofErr w:type="gramStart"/>
+      <w:r>
+        <w:t>appears?</w:t>
+      </w:r>
+      <w:proofErr w:type="gramEnd"/>
+    </w:p>
+    <w:p>
+      <w:pPr>
+        <w:pStyle w:val="ListParagraph"/>
+        <w:numPr>
+          <w:ilvl w:val="2"/>
+          <w:numId w:val="1"/>
+        </w:numPr>
+      </w:pPr>
+      <w:r>
+        <w:t>Or give some time to accumulate user reactions to it</w:t>
+      </w:r>
+    </w:p>
+    <w:p>
+      <w:pPr>
+        <w:pStyle w:val="ListParagraph"/>
+        <w:numPr>
+          <w:ilvl w:val="2"/>
+          <w:numId w:val="1"/>
+        </w:numPr>
+      </w:pPr>
+      <w:r>
+        <w:t>But the goal is to minimize the harm caused</w:t>
+      </w:r>
+    </w:p>
+    <w:p>
+      <w:pPr>
+        <w:pStyle w:val="ListParagraph"/>
+        <w:numPr>
+          <w:ilvl w:val="1"/>
+          <w:numId w:val="1"/>
+        </w:numPr>
+      </w:pPr>
+      <w:r>
+        <w:t xml:space="preserve">Do we have data available for the initial </w:t>
+      </w:r>
+      <w:proofErr w:type="gramStart"/>
+      <w:r>
+        <w:t>training</w:t>
+      </w:r>
+      <w:proofErr w:type="gramEnd"/>
+      <w:r>
+        <w:t xml:space="preserve"> or will we need a cold start? </w:t>
+      </w:r>
+    </w:p>
+    <w:p>
+      <w:pPr>
+        <w:pStyle w:val="ListParagraph"/>
+        <w:numPr>
+          <w:ilvl w:val="2"/>
+          <w:numId w:val="1"/>
+        </w:numPr>
+      </w:pPr>
+      <w:r>
+        <w:t xml:space="preserve">Assume we have small amount of labelled data (50k examples, 50% harmful and 50% benign) available for </w:t>
+      </w:r>
+      <w:proofErr w:type="spellStart"/>
+      <w:r>
+        <w:t>intial</w:t>
+      </w:r>
+      <w:proofErr w:type="spellEnd"/>
+      <w:r>
+        <w:t xml:space="preserve"> training</w:t>
+      </w:r>
+    </w:p>
+    <w:p>
+      <w:pPr>
+        <w:pStyle w:val="ListParagraph"/>
+        <w:numPr>
+          <w:ilvl w:val="1"/>
+          <w:numId w:val="1"/>
+        </w:numPr>
+      </w:pPr>
+      <w:r>
+        <w:t xml:space="preserve">How many posts are made per day? </w:t>
+      </w:r>
+    </w:p>
+    <w:p>
+      <w:pPr>
+        <w:pStyle w:val="ListParagraph"/>
+        <w:numPr>
+          <w:ilvl w:val="2"/>
+          <w:numId w:val="1"/>
+        </w:numPr>
+      </w:pPr>
+      <w:r>
+        <w:t>Assume 1 billion per day</w:t>
+      </w:r>
+    </w:p>
+    <w:p>
+      <w:pPr>
+        <w:pStyle w:val="ListParagraph"/>
+        <w:numPr>
+          <w:ilvl w:val="1"/>
+          <w:numId w:val="1"/>
+        </w:numPr>
+      </w:pPr>
+      <w:r>
+        <w:t>How common are harmful posts?</w:t>
+      </w:r>
+    </w:p>
+    <w:p>
+      <w:pPr>
+        <w:pStyle w:val="ListParagraph"/>
+        <w:numPr>
+          <w:ilvl w:val="2"/>
+          <w:numId w:val="1"/>
+        </w:numPr>
+      </w:pPr>
+      <w:r>
+        <w:t>Rare, &lt;1%, but with billions of posts it can add up</w:t>
+      </w:r>
+    </w:p>
+    <w:p>
+      <w:pPr>
+        <w:pStyle w:val="ListParagraph"/>
+        <w:numPr>
+          <w:ilvl w:val="1"/>
+          <w:numId w:val="1"/>
+        </w:numPr>
+      </w:pPr>
+      <w:r>
+        <w:t xml:space="preserve">Confirmed that this is a multi-modal classification problem. The scale is </w:t>
+      </w:r>
+      <w:proofErr w:type="gramStart"/>
+      <w:r>
+        <w:t>large</w:t>
+      </w:r>
+      <w:proofErr w:type="gramEnd"/>
+      <w:r>
+        <w:t xml:space="preserve"> and we know the type of data we will be dealing with. We </w:t>
+      </w:r>
+      <w:proofErr w:type="gramStart"/>
+      <w:r>
+        <w:t>understands</w:t>
+      </w:r>
+      <w:proofErr w:type="gramEnd"/>
+      <w:r>
+        <w:t xml:space="preserve"> that there are different options to delete the harmful contents</w:t>
+      </w:r>
+    </w:p>
+    <w:p>
+      <w:pPr>
+        <w:pStyle w:val="ListParagraph"/>
+        <w:numPr>
+          <w:ilvl w:val="0"/>
+          <w:numId w:val="1"/>
+        </w:numPr>
+      </w:pPr>
+      <w:r>
+        <w:t>Establish a business objective</w:t>
+      </w:r>
+    </w:p>
+    <w:p>
+      <w:pPr>
+        <w:pStyle w:val="ListParagraph"/>
+        <w:numPr>
+          <w:ilvl w:val="1"/>
+          <w:numId w:val="1"/>
+        </w:numPr>
+      </w:pPr>
+      <w:r>
+        <w:lastRenderedPageBreak/>
+        <w:t>It may be easy to say that all harmful contents detected will be deleted</w:t>
+      </w:r>
+      <w:r>
+        <w:t xml:space="preserve">, but it will create a lot of false positive. Instead, we should set up precision guardrails like 95% precision to minimize false positives so users would have better experience. A better business objective is to minimize views of the harmful content while subject to precision guardrails. Some contents may not get </w:t>
+      </w:r>
+      <w:proofErr w:type="gramStart"/>
+      <w:r>
+        <w:t>much</w:t>
+      </w:r>
+      <w:proofErr w:type="gramEnd"/>
+      <w:r>
+        <w:t xml:space="preserve"> views at all, so if no one looks at them, </w:t>
+      </w:r>
+      <w:r>
+        <w:t xml:space="preserve">maybe they can stay there for a little bit longer. The ones that get more view will get prioritized for harmful content detection. </w:t>
+      </w:r>
+    </w:p>
+    <w:p>
+      <w:pPr>
+        <w:pStyle w:val="ListParagraph"/>
+        <w:numPr>
+          <w:ilvl w:val="1"/>
+          <w:numId w:val="1"/>
+        </w:numPr>
+      </w:pPr>
+      <w:r>
+        <w:t>Besides, as it gets more view, more user reactions accumulate, it will be easier for correct detection</w:t>
+      </w:r>
+    </w:p>
+    <w:p>
+      <w:pPr>
+        <w:pStyle w:val="ListParagraph"/>
+        <w:numPr>
+          <w:ilvl w:val="1"/>
+          <w:numId w:val="1"/>
+        </w:numPr>
+      </w:pPr>
+    </w:p>
     <w:p/>
     <w:p/>
     <w:p/>
@@ -20,6 +405,126 @@
     </w:sectPr>
   </w:body>
 </w:document>
+</file>
+
+<file path=word/numbering.xml><?xml version="1.0" encoding="utf-8"?>
+<w:numbering xmlns:wpc="http://schemas.microsoft.com/office/word/2010/wordprocessingCanvas" xmlns:cx="http://schemas.microsoft.com/office/drawing/2014/chartex" xmlns:cx1="http://schemas.microsoft.com/office/drawing/2015/9/8/chartex" xmlns:cx2="http://schemas.microsoft.com/office/drawing/2015/10/21/chartex" xmlns:cx3="http://schemas.microsoft.com/office/drawing/2016/5/9/chartex" xmlns:cx4="http://schemas.microsoft.com/office/drawing/2016/5/10/chartex" xmlns:cx5="http://schemas.microsoft.com/office/drawing/2016/5/11/chartex" xmlns:cx6="http://schemas.microsoft.com/office/drawing/2016/5/12/chartex" xmlns:cx7="http://schemas.microsoft.com/office/drawing/2016/5/13/chartex" xmlns:cx8="http://schemas.microsoft.com/office/drawing/2016/5/14/chartex" xmlns:mc="http://schemas.openxmlformats.org/markup-compatibility/2006" xmlns:aink="http://schemas.microsoft.com/office/drawing/2016/ink" xmlns:am3d="http://schemas.microsoft.com/office/drawing/2017/model3d" xmlns:o="urn:schemas-microsoft-com:office:office" xmlns:oel="http://schemas.microsoft.com/office/2019/extlst" xmlns:r="http://schemas.openxmlformats.org/officeDocument/2006/relationships" xmlns:m="http://schemas.openxmlformats.org/officeDocument/2006/math" xmlns:v="urn:schemas-microsoft-com:vml" xmlns:wp14="http://schemas.microsoft.com/office/word/2010/wordprocessingDrawing" xmlns:wp="http://schemas.openxmlformats.org/drawingml/2006/wordprocessingDrawing" xmlns:w10="urn:schemas-microsoft-com:office:word" xmlns:w="http://schemas.openxmlformats.org/wordprocessingml/2006/main" xmlns:w14="http://schemas.microsoft.com/office/word/2010/wordml" xmlns:w15="http://schemas.microsoft.com/office/word/2012/wordml" xmlns:w16cex="http://schemas.microsoft.com/office/word/2018/wordml/cex" xmlns:w16cid="http://schemas.microsoft.com/office/word/2016/wordml/cid" xmlns:w16="http://schemas.microsoft.com/office/word/2018/wordml" xmlns:w16du="http://schemas.microsoft.com/office/word/2023/wordml/word16du" xmlns:w16sdtdh="http://schemas.microsoft.com/office/word/2020/wordml/sdtdatahash" xmlns:w16sdtfl="http://schemas.microsoft.com/office/word/2024/wordml/sdtformatlock" xmlns:w16se="http://schemas.microsoft.com/office/word/2015/wordml/symex" xmlns:wpg="http://schemas.microsoft.com/office/word/2010/wordprocessingGroup" xmlns:wpi="http://schemas.microsoft.com/office/word/2010/wordprocessingInk" xmlns:wne="http://schemas.microsoft.com/office/word/2006/wordml" xmlns:wps="http://schemas.microsoft.com/office/word/2010/wordprocessingShape" mc:Ignorable="w14 w15 w16se w16cid w16 w16cex w16sdtdh w16sdtfl w16du wp14">
+  <w:abstractNum w:abstractNumId="0" w15:restartNumberingAfterBreak="0">
+    <w:nsid w:val="0C111E18"/>
+    <w:multiLevelType w:val="hybridMultilevel"/>
+    <w:tmpl w:val="66CC401C"/>
+    <w:lvl w:ilvl="0" w:tplc="B20E59D2">
+      <w:numFmt w:val="bullet"/>
+      <w:lvlText w:val="-"/>
+      <w:lvlJc w:val="left"/>
+      <w:pPr>
+        <w:ind w:left="720" w:hanging="360"/>
+      </w:pPr>
+      <w:rPr>
+        <w:rFonts w:ascii="Aptos" w:eastAsiaTheme="minorEastAsia" w:hAnsi="Aptos" w:cstheme="minorBidi" w:hint="default"/>
+      </w:rPr>
+    </w:lvl>
+    <w:lvl w:ilvl="1" w:tplc="04090003">
+      <w:start w:val="1"/>
+      <w:numFmt w:val="bullet"/>
+      <w:lvlText w:val="o"/>
+      <w:lvlJc w:val="left"/>
+      <w:pPr>
+        <w:ind w:left="1440" w:hanging="360"/>
+      </w:pPr>
+      <w:rPr>
+        <w:rFonts w:ascii="Courier New" w:hAnsi="Courier New" w:cs="Courier New" w:hint="default"/>
+      </w:rPr>
+    </w:lvl>
+    <w:lvl w:ilvl="2" w:tplc="04090005">
+      <w:start w:val="1"/>
+      <w:numFmt w:val="bullet"/>
+      <w:lvlText w:val=""/>
+      <w:lvlJc w:val="left"/>
+      <w:pPr>
+        <w:ind w:left="2160" w:hanging="360"/>
+      </w:pPr>
+      <w:rPr>
+        <w:rFonts w:ascii="Wingdings" w:hAnsi="Wingdings" w:hint="default"/>
+      </w:rPr>
+    </w:lvl>
+    <w:lvl w:ilvl="3" w:tplc="04090001" w:tentative="1">
+      <w:start w:val="1"/>
+      <w:numFmt w:val="bullet"/>
+      <w:lvlText w:val=""/>
+      <w:lvlJc w:val="left"/>
+      <w:pPr>
+        <w:ind w:left="2880" w:hanging="360"/>
+      </w:pPr>
+      <w:rPr>
+        <w:rFonts w:ascii="Symbol" w:hAnsi="Symbol" w:hint="default"/>
+      </w:rPr>
+    </w:lvl>
+    <w:lvl w:ilvl="4" w:tplc="04090003" w:tentative="1">
+      <w:start w:val="1"/>
+      <w:numFmt w:val="bullet"/>
+      <w:lvlText w:val="o"/>
+      <w:lvlJc w:val="left"/>
+      <w:pPr>
+        <w:ind w:left="3600" w:hanging="360"/>
+      </w:pPr>
+      <w:rPr>
+        <w:rFonts w:ascii="Courier New" w:hAnsi="Courier New" w:cs="Courier New" w:hint="default"/>
+      </w:rPr>
+    </w:lvl>
+    <w:lvl w:ilvl="5" w:tplc="04090005" w:tentative="1">
+      <w:start w:val="1"/>
+      <w:numFmt w:val="bullet"/>
+      <w:lvlText w:val=""/>
+      <w:lvlJc w:val="left"/>
+      <w:pPr>
+        <w:ind w:left="4320" w:hanging="360"/>
+      </w:pPr>
+      <w:rPr>
+        <w:rFonts w:ascii="Wingdings" w:hAnsi="Wingdings" w:hint="default"/>
+      </w:rPr>
+    </w:lvl>
+    <w:lvl w:ilvl="6" w:tplc="04090001" w:tentative="1">
+      <w:start w:val="1"/>
+      <w:numFmt w:val="bullet"/>
+      <w:lvlText w:val=""/>
+      <w:lvlJc w:val="left"/>
+      <w:pPr>
+        <w:ind w:left="5040" w:hanging="360"/>
+      </w:pPr>
+      <w:rPr>
+        <w:rFonts w:ascii="Symbol" w:hAnsi="Symbol" w:hint="default"/>
+      </w:rPr>
+    </w:lvl>
+    <w:lvl w:ilvl="7" w:tplc="04090003" w:tentative="1">
+      <w:start w:val="1"/>
+      <w:numFmt w:val="bullet"/>
+      <w:lvlText w:val="o"/>
+      <w:lvlJc w:val="left"/>
+      <w:pPr>
+        <w:ind w:left="5760" w:hanging="360"/>
+      </w:pPr>
+      <w:rPr>
+        <w:rFonts w:ascii="Courier New" w:hAnsi="Courier New" w:cs="Courier New" w:hint="default"/>
+      </w:rPr>
+    </w:lvl>
+    <w:lvl w:ilvl="8" w:tplc="04090005" w:tentative="1">
+      <w:start w:val="1"/>
+      <w:numFmt w:val="bullet"/>
+      <w:lvlText w:val=""/>
+      <w:lvlJc w:val="left"/>
+      <w:pPr>
+        <w:ind w:left="6480" w:hanging="360"/>
+      </w:pPr>
+      <w:rPr>
+        <w:rFonts w:ascii="Wingdings" w:hAnsi="Wingdings" w:hint="default"/>
+      </w:rPr>
+    </w:lvl>
+  </w:abstractNum>
+  <w:num w:numId="1" w16cid:durableId="283771462">
+    <w:abstractNumId w:val="0"/>
+  </w:num>
+</w:numbering>
 </file>
 
 <file path=word/styles.xml><?xml version="1.0" encoding="utf-8"?>

</xml_diff>

<commit_message>
updated the design doc
</commit_message>
<xml_diff>
--- a/ML Design.docx
+++ b/ML Design.docx
@@ -2247,21 +2247,7 @@
                 <w:rStyle w:val="Hyperlink"/>
                 <w:noProof/>
               </w:rPr>
-              <w:t>Self Atten</w:t>
-            </w:r>
-            <w:r>
-              <w:rPr>
-                <w:rStyle w:val="Hyperlink"/>
-                <w:noProof/>
-              </w:rPr>
-              <w:t>t</w:t>
-            </w:r>
-            <w:r>
-              <w:rPr>
-                <w:rStyle w:val="Hyperlink"/>
-                <w:noProof/>
-              </w:rPr>
-              <w:t>ion-</w:t>
+              <w:t>Self Attention-</w:t>
             </w:r>
             <w:r>
               <w:rPr>
@@ -3612,8 +3598,8 @@
         <w:rPr>
           <w:noProof/>
         </w:rPr>
-        <w:pict w14:anchorId="2461DE95">
-          <v:rect id="_x0000_i1025" alt="" style="width:468pt;height:.05pt;mso-width-percent:0;mso-height-percent:0;mso-width-percent:0;mso-height-percent:0" o:hralign="center" o:hrstd="t" o:hr="t" fillcolor="#a0a0a0" stroked="f"/>
+        <w:pict w14:anchorId="38CDDF49">
+          <v:rect id="_x0000_i1041" alt="" style="width:468pt;height:.05pt;mso-width-percent:0;mso-height-percent:0;mso-width-percent:0;mso-height-percent:0" o:hralign="center" o:hrstd="t" o:hr="t" fillcolor="#a0a0a0" stroked="f"/>
         </w:pict>
       </w:r>
     </w:p>
@@ -3704,8 +3690,8 @@
         <w:rPr>
           <w:noProof/>
         </w:rPr>
-        <w:pict w14:anchorId="03782444">
-          <v:rect id="_x0000_i1026" alt="" style="width:468pt;height:.05pt;mso-width-percent:0;mso-height-percent:0;mso-width-percent:0;mso-height-percent:0" o:hralign="center" o:hrstd="t" o:hr="t" fillcolor="#a0a0a0" stroked="f"/>
+        <w:pict w14:anchorId="031844FC">
+          <v:rect id="_x0000_i1040" alt="" style="width:468pt;height:.05pt;mso-width-percent:0;mso-height-percent:0;mso-width-percent:0;mso-height-percent:0" o:hralign="center" o:hrstd="t" o:hr="t" fillcolor="#a0a0a0" stroked="f"/>
         </w:pict>
       </w:r>
     </w:p>
@@ -3787,8 +3773,8 @@
           <w:noProof/>
         </w:rPr>
         <w:lastRenderedPageBreak/>
-        <w:pict w14:anchorId="35DB5E03">
-          <v:rect id="_x0000_i1027" alt="" style="width:468pt;height:.05pt;mso-width-percent:0;mso-height-percent:0;mso-width-percent:0;mso-height-percent:0" o:hralign="center" o:hrstd="t" o:hr="t" fillcolor="#a0a0a0" stroked="f"/>
+        <w:pict w14:anchorId="7254356A">
+          <v:rect id="_x0000_i1039" alt="" style="width:468pt;height:.05pt;mso-width-percent:0;mso-height-percent:0;mso-width-percent:0;mso-height-percent:0" o:hralign="center" o:hrstd="t" o:hr="t" fillcolor="#a0a0a0" stroked="f"/>
         </w:pict>
       </w:r>
     </w:p>
@@ -3846,8 +3832,8 @@
         <w:rPr>
           <w:noProof/>
         </w:rPr>
-        <w:pict w14:anchorId="3850BF27">
-          <v:rect id="_x0000_i1028" alt="" style="width:468pt;height:.05pt;mso-width-percent:0;mso-height-percent:0;mso-width-percent:0;mso-height-percent:0" o:hralign="center" o:hrstd="t" o:hr="t" fillcolor="#a0a0a0" stroked="f"/>
+        <w:pict w14:anchorId="6392BB6D">
+          <v:rect id="_x0000_i1038" alt="" style="width:468pt;height:.05pt;mso-width-percent:0;mso-height-percent:0;mso-width-percent:0;mso-height-percent:0" o:hralign="center" o:hrstd="t" o:hr="t" fillcolor="#a0a0a0" stroked="f"/>
         </w:pict>
       </w:r>
     </w:p>
@@ -3895,8 +3881,8 @@
         <w:rPr>
           <w:noProof/>
         </w:rPr>
-        <w:pict w14:anchorId="24D2E3AB">
-          <v:rect id="_x0000_i1029" alt="" style="width:468pt;height:.05pt;mso-width-percent:0;mso-height-percent:0;mso-width-percent:0;mso-height-percent:0" o:hralign="center" o:hrstd="t" o:hr="t" fillcolor="#a0a0a0" stroked="f"/>
+        <w:pict w14:anchorId="7AE1A22E">
+          <v:rect id="_x0000_i1037" alt="" style="width:468pt;height:.05pt;mso-width-percent:0;mso-height-percent:0;mso-width-percent:0;mso-height-percent:0" o:hralign="center" o:hrstd="t" o:hr="t" fillcolor="#a0a0a0" stroked="f"/>
         </w:pict>
       </w:r>
     </w:p>
@@ -3956,8 +3942,8 @@
         <w:rPr>
           <w:noProof/>
         </w:rPr>
-        <w:pict w14:anchorId="58110E92">
-          <v:rect id="_x0000_i1030" alt="" style="width:468pt;height:.05pt;mso-width-percent:0;mso-height-percent:0;mso-width-percent:0;mso-height-percent:0" o:hralign="center" o:hrstd="t" o:hr="t" fillcolor="#a0a0a0" stroked="f"/>
+        <w:pict w14:anchorId="02BB7433">
+          <v:rect id="_x0000_i1036" alt="" style="width:468pt;height:.05pt;mso-width-percent:0;mso-height-percent:0;mso-width-percent:0;mso-height-percent:0" o:hralign="center" o:hrstd="t" o:hr="t" fillcolor="#a0a0a0" stroked="f"/>
         </w:pict>
       </w:r>
     </w:p>
@@ -4012,8 +3998,8 @@
         <w:rPr>
           <w:noProof/>
         </w:rPr>
-        <w:pict w14:anchorId="0BB9DE97">
-          <v:rect id="_x0000_i1031" alt="" style="width:468pt;height:.05pt;mso-width-percent:0;mso-height-percent:0;mso-width-percent:0;mso-height-percent:0" o:hralign="center" o:hrstd="t" o:hr="t" fillcolor="#a0a0a0" stroked="f"/>
+        <w:pict w14:anchorId="18CE1C5C">
+          <v:rect id="_x0000_i1035" alt="" style="width:468pt;height:.05pt;mso-width-percent:0;mso-height-percent:0;mso-width-percent:0;mso-height-percent:0" o:hralign="center" o:hrstd="t" o:hr="t" fillcolor="#a0a0a0" stroked="f"/>
         </w:pict>
       </w:r>
     </w:p>
@@ -4094,8 +4080,8 @@
         <w:rPr>
           <w:noProof/>
         </w:rPr>
-        <w:pict w14:anchorId="3BB457F2">
-          <v:rect id="_x0000_i1032" alt="" style="width:468pt;height:.05pt;mso-width-percent:0;mso-height-percent:0;mso-width-percent:0;mso-height-percent:0" o:hralign="center" o:hrstd="t" o:hr="t" fillcolor="#a0a0a0" stroked="f"/>
+        <w:pict w14:anchorId="126F492C">
+          <v:rect id="_x0000_i1034" alt="" style="width:468pt;height:.05pt;mso-width-percent:0;mso-height-percent:0;mso-width-percent:0;mso-height-percent:0" o:hralign="center" o:hrstd="t" o:hr="t" fillcolor="#a0a0a0" stroked="f"/>
         </w:pict>
       </w:r>
     </w:p>
@@ -5958,15 +5944,7 @@
         <w:t xml:space="preserve">Use when classes are balanced, </w:t>
       </w:r>
       <w:r>
-        <w:t xml:space="preserve">care equally about performance </w:t>
-      </w:r>
-      <w:proofErr w:type="gramStart"/>
-      <w:r>
-        <w:t>on</w:t>
-      </w:r>
-      <w:proofErr w:type="gramEnd"/>
-      <w:r>
-        <w:t xml:space="preserve"> both classes, rare positives are not the </w:t>
+        <w:t xml:space="preserve">care equally about performance on both classes, rare positives are not the </w:t>
       </w:r>
       <w:proofErr w:type="gramStart"/>
       <w:r>
@@ -6061,6 +6039,9 @@
         </w:numPr>
       </w:pPr>
       <w:r>
+        <w:rPr>
+          <w:noProof/>
+        </w:rPr>
         <w:lastRenderedPageBreak/>
         <w:drawing>
           <wp:inline distT="0" distB="0" distL="0" distR="0" wp14:anchorId="1459F1C3" wp14:editId="6421514A">
@@ -6230,15 +6211,7 @@
         </w:numPr>
       </w:pPr>
       <w:r>
-        <w:t xml:space="preserve"> Instead of giving every user </w:t>
-      </w:r>
-      <w:proofErr w:type="gramStart"/>
-      <w:r>
-        <w:t>completely</w:t>
-      </w:r>
-      <w:proofErr w:type="gramEnd"/>
-      <w:r>
-        <w:t xml:space="preserve"> independent vector, the embedding is computed by looking at their graph </w:t>
+        <w:t xml:space="preserve"> Instead of giving every user completely independent vector, the embedding is computed by looking at their graph </w:t>
       </w:r>
       <w:proofErr w:type="gramStart"/>
       <w:r>
@@ -6306,12 +6279,10 @@
         <w:t xml:space="preserve">will user A interact </w:t>
       </w:r>
       <w:proofErr w:type="spellStart"/>
-      <w:proofErr w:type="gramStart"/>
       <w:r>
         <w:t>wit</w:t>
       </w:r>
       <w:proofErr w:type="spellEnd"/>
-      <w:proofErr w:type="gramEnd"/>
       <w:r>
         <w:t xml:space="preserve"> user B/content C?)</w:t>
       </w:r>
@@ -6699,19 +6670,7 @@
           <w:rPr>
             <w:rStyle w:val="Hyperlink"/>
           </w:rPr>
-          <w:t>https://learnop</w:t>
-        </w:r>
-        <w:r>
-          <w:rPr>
-            <w:rStyle w:val="Hyperlink"/>
-          </w:rPr>
-          <w:t>e</w:t>
-        </w:r>
-        <w:r>
-          <w:rPr>
-            <w:rStyle w:val="Hyperlink"/>
-          </w:rPr>
-          <w:t>ncv.com/attention-mechanism-in-transformer-neural-networks/#Step-1,-Query,-key-value</w:t>
+          <w:t>https://learnopencv.com/attention-mechanism-in-transformer-neural-networks/#Step-1,-Query,-key-value</w:t>
         </w:r>
       </w:hyperlink>
     </w:p>
@@ -6724,18 +6683,10 @@
         </w:numPr>
       </w:pPr>
       <w:r>
-        <w:t xml:space="preserve">When </w:t>
-      </w:r>
-      <w:proofErr w:type="gramStart"/>
-      <w:r>
-        <w:t xml:space="preserve">embeddings </w:t>
-      </w:r>
-      <w:r>
-        <w:t>input</w:t>
-      </w:r>
-      <w:proofErr w:type="gramEnd"/>
-      <w:r>
-        <w:t xml:space="preserve"> into the transformer, </w:t>
+        <w:t xml:space="preserve">When embeddings </w:t>
+      </w:r>
+      <w:r>
+        <w:t xml:space="preserve">input into the transformer, </w:t>
       </w:r>
       <w:r>
         <w:t xml:space="preserve">3 vectors are generated, </w:t>
@@ -6853,15 +6804,7 @@
         </w:numPr>
       </w:pPr>
       <w:r>
-        <w:t xml:space="preserve">Key </w:t>
-      </w:r>
-      <w:proofErr w:type="gramStart"/>
-      <w:r>
-        <w:t>capture</w:t>
-      </w:r>
-      <w:proofErr w:type="gramEnd"/>
-      <w:r>
-        <w:t xml:space="preserve"> what the </w:t>
+        <w:t xml:space="preserve">Key capture what the </w:t>
       </w:r>
       <w:r>
         <w:t>token has to offer</w:t>
@@ -6897,11 +6840,9 @@
       <w:r>
         <w:t xml:space="preserve"> let each input </w:t>
       </w:r>
-      <w:proofErr w:type="gramStart"/>
       <w:r>
         <w:t>token</w:t>
       </w:r>
-      <w:proofErr w:type="gramEnd"/>
       <w:r>
         <w:t xml:space="preserve"> ask questions and receive answers. </w:t>
       </w:r>
@@ -6972,23 +6913,7 @@
         <w:t xml:space="preserve">We use Attention Matrix to </w:t>
       </w:r>
       <w:r>
-        <w:t xml:space="preserve">take the dot </w:t>
-      </w:r>
-      <w:proofErr w:type="gramStart"/>
-      <w:r>
-        <w:t>produce</w:t>
-      </w:r>
-      <w:proofErr w:type="gramEnd"/>
-      <w:r>
-        <w:t xml:space="preserve"> </w:t>
-      </w:r>
-      <w:proofErr w:type="gramStart"/>
-      <w:r>
-        <w:t>of</w:t>
-      </w:r>
-      <w:proofErr w:type="gramEnd"/>
-      <w:r>
-        <w:t xml:space="preserve"> N query vectors with all N key vectors</w:t>
+        <w:t>take the dot produce of N query vectors with all N key vectors</w:t>
       </w:r>
       <w:r>
         <w:t xml:space="preserve">. Since the result of dot product is just a number. It will produce </w:t>
@@ -7014,6 +6939,9 @@
         </w:numPr>
       </w:pPr>
       <w:r>
+        <w:rPr>
+          <w:noProof/>
+        </w:rPr>
         <w:drawing>
           <wp:inline distT="0" distB="0" distL="0" distR="0" wp14:anchorId="4300E96F" wp14:editId="7CB77F20">
             <wp:extent cx="3086100" cy="2824123"/>
@@ -7147,10 +7075,50 @@
       <w:pPr>
         <w:pStyle w:val="ListParagraph"/>
         <w:numPr>
+          <w:ilvl w:val="1"/>
+          <w:numId w:val="36"/>
+        </w:numPr>
+      </w:pPr>
+      <w:r>
+        <w:t xml:space="preserve">Matrix multiplication of the attention matrix (after </w:t>
+      </w:r>
+      <w:proofErr w:type="spellStart"/>
+      <w:r>
+        <w:t>softmax</w:t>
+      </w:r>
+      <w:proofErr w:type="spellEnd"/>
+      <w:r>
+        <w:t xml:space="preserve">) and the value vector. </w:t>
+      </w:r>
+      <w:r>
+        <w:t>This produces a new representation for each token by combining its own embedding with contextually relevant information from other tokens.”</w:t>
+      </w:r>
+    </w:p>
+    <w:p>
+      <w:pPr>
+        <w:pStyle w:val="Heading2"/>
+      </w:pPr>
+      <w:proofErr w:type="spellStart"/>
+      <w:r>
+        <w:lastRenderedPageBreak/>
+        <w:t>Multihead</w:t>
+      </w:r>
+      <w:proofErr w:type="spellEnd"/>
+      <w:r>
+        <w:t xml:space="preserve"> attention</w:t>
+      </w:r>
+    </w:p>
+    <w:p>
+      <w:pPr>
+        <w:pStyle w:val="ListParagraph"/>
+        <w:numPr>
           <w:ilvl w:val="0"/>
           <w:numId w:val="36"/>
         </w:numPr>
       </w:pPr>
+      <w:r>
+        <w:t xml:space="preserve">Run self-attention multiple time in parallel, each with its own learned projections, then combine results. It allows the model to learn different types of relationships simultaneously, making contextual embedding much richer. (e.g. head1 might track long-range dependencies, head2 might focus on local context, and head3 might encode positional or punctuation clues. </w:t>
+      </w:r>
     </w:p>
     <w:p>
       <w:pPr>
@@ -7158,7 +7126,6 @@
       </w:pPr>
       <w:bookmarkStart w:id="31" w:name="_Toc210226941"/>
       <w:r>
-        <w:lastRenderedPageBreak/>
         <w:t>Pretrain Model Table</w:t>
       </w:r>
       <w:bookmarkEnd w:id="31"/>
@@ -7929,7 +7896,16 @@
                 <w:kern w:val="0"/>
                 <w14:ligatures w14:val="none"/>
               </w:rPr>
-              <w:t xml:space="preserve"> (audio classification) </w:t>
+              <w:t xml:space="preserve"> </w:t>
+            </w:r>
+            <w:r>
+              <w:rPr>
+                <w:rFonts w:eastAsia="Times New Roman" w:cs="Times New Roman"/>
+                <w:kern w:val="0"/>
+                <w14:ligatures w14:val="none"/>
+              </w:rPr>
+              <w:lastRenderedPageBreak/>
+              <w:t xml:space="preserve">(audio classification) </w:t>
             </w:r>
             <w:r>
               <w:rPr>
@@ -7971,7 +7947,17 @@
                 <w:kern w:val="0"/>
                 <w14:ligatures w14:val="none"/>
               </w:rPr>
-              <w:t>- Self-supervised: learn from raw audio - Transferable across speech/audio tasks - Whisper robust to noise, supports many languages</w:t>
+              <w:lastRenderedPageBreak/>
+              <w:t xml:space="preserve">- Self-supervised: learn from raw audio - </w:t>
+            </w:r>
+            <w:r>
+              <w:rPr>
+                <w:rFonts w:eastAsia="Times New Roman" w:cs="Times New Roman"/>
+                <w:kern w:val="0"/>
+                <w14:ligatures w14:val="none"/>
+              </w:rPr>
+              <w:lastRenderedPageBreak/>
+              <w:t>Transferable across speech/audio tasks - Whisper robust to noise, supports many languages</w:t>
             </w:r>
           </w:p>
         </w:tc>
@@ -7995,7 +7981,17 @@
                 <w:kern w:val="0"/>
                 <w14:ligatures w14:val="none"/>
               </w:rPr>
-              <w:t>- Less standardized than text/vision - Expensive for long audio clips - Weak transfer across domains (speech ↔ music ↔ ambient) - Training data often noisy/biased</w:t>
+              <w:lastRenderedPageBreak/>
+              <w:t xml:space="preserve">- Less standardized than text/vision - Expensive for long </w:t>
+            </w:r>
+            <w:r>
+              <w:rPr>
+                <w:rFonts w:eastAsia="Times New Roman" w:cs="Times New Roman"/>
+                <w:kern w:val="0"/>
+                <w14:ligatures w14:val="none"/>
+              </w:rPr>
+              <w:lastRenderedPageBreak/>
+              <w:t>audio clips - Weak transfer across domains (speech ↔ music ↔ ambient) - Training data often noisy/biased</w:t>
             </w:r>
           </w:p>
         </w:tc>
@@ -8019,7 +8015,17 @@
                 <w:kern w:val="0"/>
                 <w14:ligatures w14:val="none"/>
               </w:rPr>
-              <w:t>- Harmful speech detection (hate, harassment) - Multilingual ASR/transcription - Speaker ID, voice biometrics - Audio event detection (gunshots, alarms)</w:t>
+              <w:lastRenderedPageBreak/>
+              <w:t xml:space="preserve">- Harmful speech detection (hate, harassment) - Multilingual ASR/transcription - </w:t>
+            </w:r>
+            <w:r>
+              <w:rPr>
+                <w:rFonts w:eastAsia="Times New Roman" w:cs="Times New Roman"/>
+                <w:kern w:val="0"/>
+                <w14:ligatures w14:val="none"/>
+              </w:rPr>
+              <w:lastRenderedPageBreak/>
+              <w:t>Speaker ID, voice biometrics - Audio event detection (gunshots, alarms)</w:t>
             </w:r>
           </w:p>
         </w:tc>
@@ -8051,7 +8057,6 @@
                 <w:kern w:val="0"/>
                 <w14:ligatures w14:val="none"/>
               </w:rPr>
-              <w:lastRenderedPageBreak/>
               <w:t>Video</w:t>
             </w:r>
           </w:p>
@@ -8373,6 +8378,7 @@
         </w:numPr>
       </w:pPr>
       <w:r>
+        <w:lastRenderedPageBreak/>
         <w:t>We also have a small team of moderators who can review content, but with limited capacity</w:t>
       </w:r>
     </w:p>
@@ -8433,7 +8439,6 @@
         </w:numPr>
       </w:pPr>
       <w:r>
-        <w:lastRenderedPageBreak/>
         <w:t xml:space="preserve">How quickly do we need to detect harmful content? </w:t>
       </w:r>
     </w:p>
@@ -8626,15 +8631,7 @@
       </w:r>
       <w:proofErr w:type="gramEnd"/>
       <w:r>
-        <w:t xml:space="preserve"> </w:t>
-      </w:r>
-      <w:proofErr w:type="gramStart"/>
-      <w:r>
-        <w:t>views</w:t>
-      </w:r>
-      <w:proofErr w:type="gramEnd"/>
-      <w:r>
-        <w:t xml:space="preserve"> at all, so if no one looks at them, </w:t>
+        <w:t xml:space="preserve"> views at all, so if no one looks at them, </w:t>
       </w:r>
       <w:r>
         <w:t xml:space="preserve">maybe they can stay there for a little bit longer. The ones that get more view will get prioritized for harmful content detection. </w:t>
@@ -8681,6 +8678,7 @@
     </w:p>
     <w:p>
       <w:r>
+        <w:lastRenderedPageBreak/>
         <w:t>High Level System Design:</w:t>
       </w:r>
     </w:p>
@@ -8689,7 +8687,6 @@
         <w:rPr>
           <w:noProof/>
         </w:rPr>
-        <w:lastRenderedPageBreak/>
         <w:drawing>
           <wp:inline distT="0" distB="0" distL="0" distR="0" wp14:anchorId="39CD3F16" wp14:editId="1BE58329">
             <wp:extent cx="5943600" cy="3169920"/>
@@ -9389,13 +9386,8 @@
           <w:numId w:val="1"/>
         </w:numPr>
       </w:pPr>
-      <w:proofErr w:type="gramStart"/>
-      <w:r>
-        <w:t>Normalize</w:t>
-      </w:r>
-      <w:proofErr w:type="gramEnd"/>
-      <w:r>
-        <w:t xml:space="preserve"> by exposure, 20 reports out of 10M views </w:t>
+      <w:r>
+        <w:t xml:space="preserve">Normalize by exposure, 20 reports out of 10M views </w:t>
       </w:r>
       <w:proofErr w:type="gramStart"/>
       <w:r>
@@ -9584,15 +9576,7 @@
       </w:r>
       <w:proofErr w:type="gramEnd"/>
       <w:r>
-        <w:t xml:space="preserve"> historical behavior and </w:t>
-      </w:r>
-      <w:proofErr w:type="gramStart"/>
-      <w:r>
-        <w:t>characteristic</w:t>
-      </w:r>
-      <w:proofErr w:type="gramEnd"/>
-      <w:r>
-        <w:t>, which will capture how likely they will post harmful or benign content, based on their past activity</w:t>
+        <w:t xml:space="preserve"> historical behavior and characteristic, which will capture how likely they will post harmful or benign content, based on their past activity</w:t>
       </w:r>
     </w:p>
     <w:p>
@@ -10111,23 +10095,7 @@
         <w:t>s</w:t>
       </w:r>
       <w:r>
-        <w:t xml:space="preserve"> will change over time. </w:t>
-      </w:r>
-      <w:proofErr w:type="gramStart"/>
-      <w:r>
-        <w:t>if</w:t>
-      </w:r>
-      <w:proofErr w:type="gramEnd"/>
-      <w:r>
-        <w:t xml:space="preserve"> the post is </w:t>
-      </w:r>
-      <w:proofErr w:type="gramStart"/>
-      <w:r>
-        <w:t>revaluated</w:t>
-      </w:r>
-      <w:proofErr w:type="gramEnd"/>
-      <w:r>
-        <w:t xml:space="preserve"> after some time or </w:t>
+        <w:t xml:space="preserve"> will change over time. if the post is revaluated after some time or </w:t>
       </w:r>
       <w:r>
         <w:t xml:space="preserve">after </w:t>
@@ -10310,7 +10278,7 @@
         <w:rPr>
           <w:noProof/>
         </w:rPr>
-        <w:pict w14:anchorId="47FAB52B">
+        <w:pict w14:anchorId="08BD4AD2">
           <v:rect id="_x0000_i1033" alt="" style="width:468pt;height:.05pt;mso-width-percent:0;mso-height-percent:0;mso-width-percent:0;mso-height-percent:0" o:hralign="center" o:hrstd="t" o:hr="t" fillcolor="#a0a0a0" stroked="f"/>
         </w:pict>
       </w:r>
@@ -10359,8 +10327,8 @@
         <w:rPr>
           <w:noProof/>
         </w:rPr>
-        <w:pict w14:anchorId="63F1DBE1">
-          <v:rect id="_x0000_i1034" alt="" style="width:468pt;height:.05pt;mso-width-percent:0;mso-height-percent:0;mso-width-percent:0;mso-height-percent:0" o:hralign="center" o:hrstd="t" o:hr="t" fillcolor="#a0a0a0" stroked="f"/>
+        <w:pict w14:anchorId="717217CE">
+          <v:rect id="_x0000_i1032" alt="" style="width:468pt;height:.05pt;mso-width-percent:0;mso-height-percent:0;mso-width-percent:0;mso-height-percent:0" o:hralign="center" o:hrstd="t" o:hr="t" fillcolor="#a0a0a0" stroked="f"/>
         </w:pict>
       </w:r>
     </w:p>
@@ -10404,8 +10372,8 @@
         <w:rPr>
           <w:noProof/>
         </w:rPr>
-        <w:pict w14:anchorId="7185905A">
-          <v:rect id="_x0000_i1035" alt="" style="width:468pt;height:.05pt;mso-width-percent:0;mso-height-percent:0;mso-width-percent:0;mso-height-percent:0" o:hralign="center" o:hrstd="t" o:hr="t" fillcolor="#a0a0a0" stroked="f"/>
+        <w:pict w14:anchorId="51668B34">
+          <v:rect id="_x0000_i1031" alt="" style="width:468pt;height:.05pt;mso-width-percent:0;mso-height-percent:0;mso-width-percent:0;mso-height-percent:0" o:hralign="center" o:hrstd="t" o:hr="t" fillcolor="#a0a0a0" stroked="f"/>
         </w:pict>
       </w:r>
     </w:p>
@@ -10483,8 +10451,8 @@
         <w:rPr>
           <w:noProof/>
         </w:rPr>
-        <w:pict w14:anchorId="7D682431">
-          <v:rect id="_x0000_i1036" alt="" style="width:468pt;height:.05pt;mso-width-percent:0;mso-height-percent:0;mso-width-percent:0;mso-height-percent:0" o:hralign="center" o:hrstd="t" o:hr="t" fillcolor="#a0a0a0" stroked="f"/>
+        <w:pict w14:anchorId="49FA0C20">
+          <v:rect id="_x0000_i1030" alt="" style="width:468pt;height:.05pt;mso-width-percent:0;mso-height-percent:0;mso-width-percent:0;mso-height-percent:0" o:hralign="center" o:hrstd="t" o:hr="t" fillcolor="#a0a0a0" stroked="f"/>
         </w:pict>
       </w:r>
     </w:p>
@@ -10605,8 +10573,8 @@
           <w:noProof/>
         </w:rPr>
         <w:lastRenderedPageBreak/>
-        <w:pict w14:anchorId="1F589C53">
-          <v:rect id="_x0000_i1037" alt="" style="width:468pt;height:.05pt;mso-width-percent:0;mso-height-percent:0;mso-width-percent:0;mso-height-percent:0" o:hralign="center" o:hrstd="t" o:hr="t" fillcolor="#a0a0a0" stroked="f"/>
+        <w:pict w14:anchorId="5B7E9947">
+          <v:rect id="_x0000_i1029" alt="" style="width:468pt;height:.05pt;mso-width-percent:0;mso-height-percent:0;mso-width-percent:0;mso-height-percent:0" o:hralign="center" o:hrstd="t" o:hr="t" fillcolor="#a0a0a0" stroked="f"/>
         </w:pict>
       </w:r>
     </w:p>
@@ -10787,8 +10755,8 @@
         <w:rPr>
           <w:noProof/>
         </w:rPr>
-        <w:pict w14:anchorId="7466AA1D">
-          <v:rect id="_x0000_i1038" alt="" style="width:468pt;height:.05pt;mso-width-percent:0;mso-height-percent:0;mso-width-percent:0;mso-height-percent:0" o:hralign="center" o:hrstd="t" o:hr="t" fillcolor="#a0a0a0" stroked="f"/>
+        <w:pict w14:anchorId="63AD53BE">
+          <v:rect id="_x0000_i1028" alt="" style="width:468pt;height:.05pt;mso-width-percent:0;mso-height-percent:0;mso-width-percent:0;mso-height-percent:0" o:hralign="center" o:hrstd="t" o:hr="t" fillcolor="#a0a0a0" stroked="f"/>
         </w:pict>
       </w:r>
     </w:p>
@@ -11035,8 +11003,8 @@
         <w:rPr>
           <w:noProof/>
         </w:rPr>
-        <w:pict w14:anchorId="45C0DA07">
-          <v:rect id="_x0000_i1039" alt="" style="width:468pt;height:.05pt;mso-width-percent:0;mso-height-percent:0;mso-width-percent:0;mso-height-percent:0" o:hralign="center" o:hrstd="t" o:hr="t" fillcolor="#a0a0a0" stroked="f"/>
+        <w:pict w14:anchorId="7F64B099">
+          <v:rect id="_x0000_i1027" alt="" style="width:468pt;height:.05pt;mso-width-percent:0;mso-height-percent:0;mso-width-percent:0;mso-height-percent:0" o:hralign="center" o:hrstd="t" o:hr="t" fillcolor="#a0a0a0" stroked="f"/>
         </w:pict>
       </w:r>
     </w:p>
@@ -11099,8 +11067,8 @@
         <w:rPr>
           <w:noProof/>
         </w:rPr>
-        <w:pict w14:anchorId="5CC06919">
-          <v:rect id="_x0000_i1040" alt="" style="width:468pt;height:.05pt;mso-width-percent:0;mso-height-percent:0;mso-width-percent:0;mso-height-percent:0" o:hralign="center" o:hrstd="t" o:hr="t" fillcolor="#a0a0a0" stroked="f"/>
+        <w:pict w14:anchorId="0E0C6D3B">
+          <v:rect id="_x0000_i1026" alt="" style="width:468pt;height:.05pt;mso-width-percent:0;mso-height-percent:0;mso-width-percent:0;mso-height-percent:0" o:hralign="center" o:hrstd="t" o:hr="t" fillcolor="#a0a0a0" stroked="f"/>
         </w:pict>
       </w:r>
     </w:p>
@@ -11233,8 +11201,8 @@
         <w:rPr>
           <w:noProof/>
         </w:rPr>
-        <w:pict w14:anchorId="1972D3ED">
-          <v:rect id="_x0000_i1041" alt="" style="width:468pt;height:.05pt;mso-width-percent:0;mso-height-percent:0;mso-width-percent:0;mso-height-percent:0" o:hralign="center" o:hrstd="t" o:hr="t" fillcolor="#a0a0a0" stroked="f"/>
+        <w:pict w14:anchorId="6708674D">
+          <v:rect id="_x0000_i1025" alt="" style="width:468pt;height:.05pt;mso-width-percent:0;mso-height-percent:0;mso-width-percent:0;mso-height-percent:0" o:hralign="center" o:hrstd="t" o:hr="t" fillcolor="#a0a0a0" stroked="f"/>
         </w:pict>
       </w:r>
     </w:p>
@@ -11553,15 +11521,7 @@
         </w:numPr>
       </w:pPr>
       <w:r>
-        <w:t xml:space="preserve">As indicated earlier, reclassification </w:t>
-      </w:r>
-      <w:proofErr w:type="gramStart"/>
-      <w:r>
-        <w:t>do</w:t>
-      </w:r>
-      <w:proofErr w:type="gramEnd"/>
-      <w:r>
-        <w:t xml:space="preserve"> not require </w:t>
+        <w:t xml:space="preserve">As indicated earlier, reclassification do not require </w:t>
       </w:r>
       <w:r>
         <w:t xml:space="preserve">posts images and texts to pass through heavy embedding </w:t>

</xml_diff>